<commit_message>
finalisation synthese word 12/12/25
</commit_message>
<xml_diff>
--- a/templates/reference_doc.docx
+++ b/templates/reference_doc.docx
@@ -1,6 +1,6 @@
 
 <file path=word/document.xml><?xml version="1.0" encoding="utf-8"?>
-<w:document xmlns:wpc="http://schemas.microsoft.com/office/word/2010/wordprocessingCanvas" xmlns:cx="http://schemas.microsoft.com/office/drawing/2014/chartex" xmlns:cx1="http://schemas.microsoft.com/office/drawing/2015/9/8/chartex" xmlns:cx2="http://schemas.microsoft.com/office/drawing/2015/10/21/chartex" xmlns:cx3="http://schemas.microsoft.com/office/drawing/2016/5/9/chartex" xmlns:cx4="http://schemas.microsoft.com/office/drawing/2016/5/10/chartex" xmlns:cx5="http://schemas.microsoft.com/office/drawing/2016/5/11/chartex" xmlns:cx6="http://schemas.microsoft.com/office/drawing/2016/5/12/chartex" xmlns:cx7="http://schemas.microsoft.com/office/drawing/2016/5/13/chartex" xmlns:cx8="http://schemas.microsoft.com/office/drawing/2016/5/14/chartex" xmlns:mc="http://schemas.openxmlformats.org/markup-compatibility/2006" xmlns:aink="http://schemas.microsoft.com/office/drawing/2016/ink" xmlns:am3d="http://schemas.microsoft.com/office/drawing/2017/model3d" xmlns:o="urn:schemas-microsoft-com:office:office" xmlns:oel="http://schemas.microsoft.com/office/2019/extlst" xmlns:r="http://schemas.openxmlformats.org/officeDocument/2006/relationships" xmlns:m="http://schemas.openxmlformats.org/officeDocument/2006/math" xmlns:v="urn:schemas-microsoft-com:vml" xmlns:wp14="http://schemas.microsoft.com/office/word/2010/wordprocessingDrawing" xmlns:wp="http://schemas.openxmlformats.org/drawingml/2006/wordprocessingDrawing" xmlns:w10="urn:schemas-microsoft-com:office:word" xmlns:w="http://schemas.openxmlformats.org/wordprocessingml/2006/main" xmlns:w14="http://schemas.microsoft.com/office/word/2010/wordml" xmlns:w15="http://schemas.microsoft.com/office/word/2012/wordml" xmlns:w16cex="http://schemas.microsoft.com/office/word/2018/wordml/cex" xmlns:w16cid="http://schemas.microsoft.com/office/word/2016/wordml/cid" xmlns:w16="http://schemas.microsoft.com/office/word/2018/wordml" xmlns:w16du="http://schemas.microsoft.com/office/word/2023/wordml/word16du" xmlns:w16sdtdh="http://schemas.microsoft.com/office/word/2020/wordml/sdtdatahash" xmlns:w16se="http://schemas.microsoft.com/office/word/2015/wordml/symex" xmlns:wpg="http://schemas.microsoft.com/office/word/2010/wordprocessingGroup" xmlns:wpi="http://schemas.microsoft.com/office/word/2010/wordprocessingInk" xmlns:wne="http://schemas.microsoft.com/office/word/2006/wordml" xmlns:wps="http://schemas.microsoft.com/office/word/2010/wordprocessingShape" mc:Ignorable="w14 w15 w16se w16cid w16 w16cex w16sdtdh w16du wp14">
+<w:document xmlns:wpc="http://schemas.microsoft.com/office/word/2010/wordprocessingCanvas" xmlns:cx="http://schemas.microsoft.com/office/drawing/2014/chartex" xmlns:cx1="http://schemas.microsoft.com/office/drawing/2015/9/8/chartex" xmlns:cx2="http://schemas.microsoft.com/office/drawing/2015/10/21/chartex" xmlns:cx3="http://schemas.microsoft.com/office/drawing/2016/5/9/chartex" xmlns:cx4="http://schemas.microsoft.com/office/drawing/2016/5/10/chartex" xmlns:cx5="http://schemas.microsoft.com/office/drawing/2016/5/11/chartex" xmlns:cx6="http://schemas.microsoft.com/office/drawing/2016/5/12/chartex" xmlns:cx7="http://schemas.microsoft.com/office/drawing/2016/5/13/chartex" xmlns:cx8="http://schemas.microsoft.com/office/drawing/2016/5/14/chartex" xmlns:mc="http://schemas.openxmlformats.org/markup-compatibility/2006" xmlns:aink="http://schemas.microsoft.com/office/drawing/2016/ink" xmlns:am3d="http://schemas.microsoft.com/office/drawing/2017/model3d" xmlns:o="urn:schemas-microsoft-com:office:office" xmlns:oel="http://schemas.microsoft.com/office/2019/extlst" xmlns:r="http://schemas.openxmlformats.org/officeDocument/2006/relationships" xmlns:m="http://schemas.openxmlformats.org/officeDocument/2006/math" xmlns:v="urn:schemas-microsoft-com:vml" xmlns:wp14="http://schemas.microsoft.com/office/word/2010/wordprocessingDrawing" xmlns:wp="http://schemas.openxmlformats.org/drawingml/2006/wordprocessingDrawing" xmlns:w10="urn:schemas-microsoft-com:office:word" xmlns:w="http://schemas.openxmlformats.org/wordprocessingml/2006/main" xmlns:w14="http://schemas.microsoft.com/office/word/2010/wordml" xmlns:w15="http://schemas.microsoft.com/office/word/2012/wordml" xmlns:w16cex="http://schemas.microsoft.com/office/word/2018/wordml/cex" xmlns:w16cid="http://schemas.microsoft.com/office/word/2016/wordml/cid" xmlns:w16="http://schemas.microsoft.com/office/word/2018/wordml" xmlns:w16du="http://schemas.microsoft.com/office/word/2023/wordml/word16du" xmlns:w16sdtdh="http://schemas.microsoft.com/office/word/2020/wordml/sdtdatahash" xmlns:w16sdtfl="http://schemas.microsoft.com/office/word/2024/wordml/sdtformatlock" xmlns:w16se="http://schemas.microsoft.com/office/word/2015/wordml/symex" xmlns:wpg="http://schemas.microsoft.com/office/word/2010/wordprocessingGroup" xmlns:wpi="http://schemas.microsoft.com/office/word/2010/wordprocessingInk" xmlns:wne="http://schemas.microsoft.com/office/word/2006/wordml" xmlns:wps="http://schemas.microsoft.com/office/word/2010/wordprocessingShape" mc:Ignorable="w14 w15 w16se w16cid w16 w16cex w16sdtdh w16sdtfl w16du wp14">
   <w:body>
     <w:p>
       <w:pPr>
@@ -1819,7 +1819,15 @@
         <w:pStyle w:val="Corpsdetexte"/>
       </w:pPr>
       <w:r>
-        <w:t>A propos de OISON :</w:t>
+        <w:t xml:space="preserve">A propos </w:t>
+      </w:r>
+      <w:proofErr w:type="gramStart"/>
+      <w:r>
+        <w:t>de OISON</w:t>
+      </w:r>
+      <w:proofErr w:type="gramEnd"/>
+      <w:r>
+        <w:t xml:space="preserve"> :</w:t>
       </w:r>
     </w:p>
     <w:p>
@@ -1843,7 +1851,15 @@
         <w:pStyle w:val="Corpsdetexte"/>
       </w:pPr>
       <w:r>
-        <w:t>Le réseau Petits et mésocarnivores (PMC) suit l’évolution de la répartition des populations de 14 espèces de carnivores en France métropolitaine, aux statuts règlementaires et de conservation variés. Les connaissances acquises grâce à ce réseau interne permettent à l’Office français de la biodiversité (OFB) d’apporter une expertise technique et scientifique sur ces espèces à tous les niveaux : départemental, régional, national et européen.</w:t>
+        <w:t xml:space="preserve">Le réseau Petits et mésocarnivores (PMC) suit l’évolution de la répartition des populations de 14 espèces de carnivores en France métropolitaine, aux statuts règlementaires et de </w:t>
+      </w:r>
+      <w:proofErr w:type="gramStart"/>
+      <w:r>
+        <w:t>conservation variés</w:t>
+      </w:r>
+      <w:proofErr w:type="gramEnd"/>
+      <w:r>
+        <w:t>. Les connaissances acquises grâce à ce réseau interne permettent à l’Office français de la biodiversité (OFB) d’apporter une expertise technique et scientifique sur ces espèces à tous les niveaux : départemental, régional, national et européen.</w:t>
       </w:r>
     </w:p>
     <w:p>
@@ -1874,6 +1890,29 @@
         <w:t>Evolution du nombre de saisies</w:t>
       </w:r>
       <w:bookmarkEnd w:id="4"/>
+    </w:p>
+    <w:p>
+      <w:pPr>
+        <w:pStyle w:val="Titre3"/>
+        <w:rPr>
+          <w:rFonts w:ascii="Times New Roman" w:hAnsi="Times New Roman" w:cs="Times New Roman"/>
+          <w:sz w:val="22"/>
+          <w:szCs w:val="22"/>
+        </w:rPr>
+      </w:pPr>
+      <w:r>
+        <w:rPr>
+          <w:rFonts w:ascii="Times New Roman" w:hAnsi="Times New Roman" w:cs="Times New Roman"/>
+          <w:sz w:val="22"/>
+          <w:szCs w:val="22"/>
+        </w:rPr>
+        <w:t>Evolution par département</w:t>
+      </w:r>
+    </w:p>
+    <w:p>
+      <w:pPr>
+        <w:pStyle w:val="Corpsdetexte"/>
+      </w:pPr>
     </w:p>
     <w:p>
       <w:pPr>
@@ -15421,6 +15460,7 @@
               <w:ind w:left="100" w:right="100"/>
               <w:jc w:val="right"/>
             </w:pPr>
+            <w:proofErr w:type="gramStart"/>
             <w:r>
               <w:rPr>
                 <w:rFonts w:ascii="Arial" w:eastAsia="Arial" w:hAnsi="Arial" w:cs="Arial"/>
@@ -15431,6 +15471,7 @@
               </w:rPr>
               <w:t>normale</w:t>
             </w:r>
+            <w:proofErr w:type="gramEnd"/>
           </w:p>
         </w:tc>
         <w:tc>
@@ -15463,6 +15504,7 @@
               <w:ind w:left="100" w:right="100"/>
               <w:jc w:val="right"/>
             </w:pPr>
+            <w:proofErr w:type="gramStart"/>
             <w:r>
               <w:rPr>
                 <w:rFonts w:ascii="Arial" w:eastAsia="Arial" w:hAnsi="Arial" w:cs="Arial"/>
@@ -15473,6 +15515,7 @@
               </w:rPr>
               <w:t>menacée</w:t>
             </w:r>
+            <w:proofErr w:type="gramEnd"/>
           </w:p>
         </w:tc>
         <w:tc>
@@ -15505,6 +15548,7 @@
               <w:ind w:left="100" w:right="100"/>
               <w:jc w:val="right"/>
             </w:pPr>
+            <w:proofErr w:type="gramStart"/>
             <w:r>
               <w:rPr>
                 <w:rFonts w:ascii="Arial" w:eastAsia="Arial" w:hAnsi="Arial" w:cs="Arial"/>
@@ -15515,6 +15559,7 @@
               </w:rPr>
               <w:t>envahissante</w:t>
             </w:r>
+            <w:proofErr w:type="gramEnd"/>
           </w:p>
         </w:tc>
         <w:tc>
@@ -16900,6 +16945,7 @@
               <w:ind w:left="100" w:right="100"/>
               <w:jc w:val="right"/>
             </w:pPr>
+            <w:proofErr w:type="gramStart"/>
             <w:r>
               <w:rPr>
                 <w:rFonts w:ascii="Arial" w:eastAsia="Arial" w:hAnsi="Arial" w:cs="Arial"/>
@@ -16910,6 +16956,7 @@
               </w:rPr>
               <w:t>protégée</w:t>
             </w:r>
+            <w:proofErr w:type="gramEnd"/>
           </w:p>
         </w:tc>
         <w:tc>
@@ -16942,6 +16989,7 @@
               <w:ind w:left="100" w:right="100"/>
               <w:jc w:val="right"/>
             </w:pPr>
+            <w:proofErr w:type="gramStart"/>
             <w:r>
               <w:rPr>
                 <w:rFonts w:ascii="Arial" w:eastAsia="Arial" w:hAnsi="Arial" w:cs="Arial"/>
@@ -16950,7 +16998,18 @@
                 <w:sz w:val="22"/>
                 <w:szCs w:val="22"/>
               </w:rPr>
-              <w:t>non protégée</w:t>
+              <w:t>non</w:t>
+            </w:r>
+            <w:proofErr w:type="gramEnd"/>
+            <w:r>
+              <w:rPr>
+                <w:rFonts w:ascii="Arial" w:eastAsia="Arial" w:hAnsi="Arial" w:cs="Arial"/>
+                <w:b/>
+                <w:color w:val="FFFFFF"/>
+                <w:sz w:val="22"/>
+                <w:szCs w:val="22"/>
+              </w:rPr>
+              <w:t xml:space="preserve"> protégée</w:t>
             </w:r>
           </w:p>
         </w:tc>
@@ -23507,7 +23566,7 @@
 </file>
 
 <file path=word/endnotes.xml><?xml version="1.0" encoding="utf-8"?>
-<w:endnotes xmlns:wpc="http://schemas.microsoft.com/office/word/2010/wordprocessingCanvas" xmlns:cx="http://schemas.microsoft.com/office/drawing/2014/chartex" xmlns:cx1="http://schemas.microsoft.com/office/drawing/2015/9/8/chartex" xmlns:cx2="http://schemas.microsoft.com/office/drawing/2015/10/21/chartex" xmlns:cx3="http://schemas.microsoft.com/office/drawing/2016/5/9/chartex" xmlns:cx4="http://schemas.microsoft.com/office/drawing/2016/5/10/chartex" xmlns:cx5="http://schemas.microsoft.com/office/drawing/2016/5/11/chartex" xmlns:cx6="http://schemas.microsoft.com/office/drawing/2016/5/12/chartex" xmlns:cx7="http://schemas.microsoft.com/office/drawing/2016/5/13/chartex" xmlns:cx8="http://schemas.microsoft.com/office/drawing/2016/5/14/chartex" xmlns:mc="http://schemas.openxmlformats.org/markup-compatibility/2006" xmlns:aink="http://schemas.microsoft.com/office/drawing/2016/ink" xmlns:am3d="http://schemas.microsoft.com/office/drawing/2017/model3d" xmlns:o="urn:schemas-microsoft-com:office:office" xmlns:oel="http://schemas.microsoft.com/office/2019/extlst" xmlns:r="http://schemas.openxmlformats.org/officeDocument/2006/relationships" xmlns:m="http://schemas.openxmlformats.org/officeDocument/2006/math" xmlns:v="urn:schemas-microsoft-com:vml" xmlns:wp14="http://schemas.microsoft.com/office/word/2010/wordprocessingDrawing" xmlns:wp="http://schemas.openxmlformats.org/drawingml/2006/wordprocessingDrawing" xmlns:w10="urn:schemas-microsoft-com:office:word" xmlns:w="http://schemas.openxmlformats.org/wordprocessingml/2006/main" xmlns:w14="http://schemas.microsoft.com/office/word/2010/wordml" xmlns:w15="http://schemas.microsoft.com/office/word/2012/wordml" xmlns:w16cex="http://schemas.microsoft.com/office/word/2018/wordml/cex" xmlns:w16cid="http://schemas.microsoft.com/office/word/2016/wordml/cid" xmlns:w16="http://schemas.microsoft.com/office/word/2018/wordml" xmlns:w16du="http://schemas.microsoft.com/office/word/2023/wordml/word16du" xmlns:w16sdtdh="http://schemas.microsoft.com/office/word/2020/wordml/sdtdatahash" xmlns:w16se="http://schemas.microsoft.com/office/word/2015/wordml/symex" xmlns:wpg="http://schemas.microsoft.com/office/word/2010/wordprocessingGroup" xmlns:wpi="http://schemas.microsoft.com/office/word/2010/wordprocessingInk" xmlns:wne="http://schemas.microsoft.com/office/word/2006/wordml" xmlns:wps="http://schemas.microsoft.com/office/word/2010/wordprocessingShape" mc:Ignorable="w14 w15 w16se w16cid w16 w16cex w16sdtdh w16du wp14">
+<w:endnotes xmlns:wpc="http://schemas.microsoft.com/office/word/2010/wordprocessingCanvas" xmlns:cx="http://schemas.microsoft.com/office/drawing/2014/chartex" xmlns:cx1="http://schemas.microsoft.com/office/drawing/2015/9/8/chartex" xmlns:cx2="http://schemas.microsoft.com/office/drawing/2015/10/21/chartex" xmlns:cx3="http://schemas.microsoft.com/office/drawing/2016/5/9/chartex" xmlns:cx4="http://schemas.microsoft.com/office/drawing/2016/5/10/chartex" xmlns:cx5="http://schemas.microsoft.com/office/drawing/2016/5/11/chartex" xmlns:cx6="http://schemas.microsoft.com/office/drawing/2016/5/12/chartex" xmlns:cx7="http://schemas.microsoft.com/office/drawing/2016/5/13/chartex" xmlns:cx8="http://schemas.microsoft.com/office/drawing/2016/5/14/chartex" xmlns:mc="http://schemas.openxmlformats.org/markup-compatibility/2006" xmlns:aink="http://schemas.microsoft.com/office/drawing/2016/ink" xmlns:am3d="http://schemas.microsoft.com/office/drawing/2017/model3d" xmlns:o="urn:schemas-microsoft-com:office:office" xmlns:oel="http://schemas.microsoft.com/office/2019/extlst" xmlns:r="http://schemas.openxmlformats.org/officeDocument/2006/relationships" xmlns:m="http://schemas.openxmlformats.org/officeDocument/2006/math" xmlns:v="urn:schemas-microsoft-com:vml" xmlns:wp14="http://schemas.microsoft.com/office/word/2010/wordprocessingDrawing" xmlns:wp="http://schemas.openxmlformats.org/drawingml/2006/wordprocessingDrawing" xmlns:w10="urn:schemas-microsoft-com:office:word" xmlns:w="http://schemas.openxmlformats.org/wordprocessingml/2006/main" xmlns:w14="http://schemas.microsoft.com/office/word/2010/wordml" xmlns:w15="http://schemas.microsoft.com/office/word/2012/wordml" xmlns:w16cex="http://schemas.microsoft.com/office/word/2018/wordml/cex" xmlns:w16cid="http://schemas.microsoft.com/office/word/2016/wordml/cid" xmlns:w16="http://schemas.microsoft.com/office/word/2018/wordml" xmlns:w16du="http://schemas.microsoft.com/office/word/2023/wordml/word16du" xmlns:w16sdtdh="http://schemas.microsoft.com/office/word/2020/wordml/sdtdatahash" xmlns:w16sdtfl="http://schemas.microsoft.com/office/word/2024/wordml/sdtformatlock" xmlns:w16se="http://schemas.microsoft.com/office/word/2015/wordml/symex" xmlns:wpg="http://schemas.microsoft.com/office/word/2010/wordprocessingGroup" xmlns:wpi="http://schemas.microsoft.com/office/word/2010/wordprocessingInk" xmlns:wne="http://schemas.microsoft.com/office/word/2006/wordml" xmlns:wps="http://schemas.microsoft.com/office/word/2010/wordprocessingShape" mc:Ignorable="w14 w15 w16se w16cid w16 w16cex w16sdtdh w16sdtfl w16du wp14">
   <w:endnote w:type="separator" w:id="-1">
     <w:p>
       <w:pPr>
@@ -23532,7 +23591,7 @@
 </file>
 
 <file path=word/footer1.xml><?xml version="1.0" encoding="utf-8"?>
-<w:ftr xmlns:wpc="http://schemas.microsoft.com/office/word/2010/wordprocessingCanvas" xmlns:cx="http://schemas.microsoft.com/office/drawing/2014/chartex" xmlns:cx1="http://schemas.microsoft.com/office/drawing/2015/9/8/chartex" xmlns:cx2="http://schemas.microsoft.com/office/drawing/2015/10/21/chartex" xmlns:cx3="http://schemas.microsoft.com/office/drawing/2016/5/9/chartex" xmlns:cx4="http://schemas.microsoft.com/office/drawing/2016/5/10/chartex" xmlns:cx5="http://schemas.microsoft.com/office/drawing/2016/5/11/chartex" xmlns:cx6="http://schemas.microsoft.com/office/drawing/2016/5/12/chartex" xmlns:cx7="http://schemas.microsoft.com/office/drawing/2016/5/13/chartex" xmlns:cx8="http://schemas.microsoft.com/office/drawing/2016/5/14/chartex" xmlns:mc="http://schemas.openxmlformats.org/markup-compatibility/2006" xmlns:aink="http://schemas.microsoft.com/office/drawing/2016/ink" xmlns:am3d="http://schemas.microsoft.com/office/drawing/2017/model3d" xmlns:o="urn:schemas-microsoft-com:office:office" xmlns:oel="http://schemas.microsoft.com/office/2019/extlst" xmlns:r="http://schemas.openxmlformats.org/officeDocument/2006/relationships" xmlns:m="http://schemas.openxmlformats.org/officeDocument/2006/math" xmlns:v="urn:schemas-microsoft-com:vml" xmlns:wp14="http://schemas.microsoft.com/office/word/2010/wordprocessingDrawing" xmlns:wp="http://schemas.openxmlformats.org/drawingml/2006/wordprocessingDrawing" xmlns:w10="urn:schemas-microsoft-com:office:word" xmlns:w="http://schemas.openxmlformats.org/wordprocessingml/2006/main" xmlns:w14="http://schemas.microsoft.com/office/word/2010/wordml" xmlns:w15="http://schemas.microsoft.com/office/word/2012/wordml" xmlns:w16cex="http://schemas.microsoft.com/office/word/2018/wordml/cex" xmlns:w16cid="http://schemas.microsoft.com/office/word/2016/wordml/cid" xmlns:w16="http://schemas.microsoft.com/office/word/2018/wordml" xmlns:w16du="http://schemas.microsoft.com/office/word/2023/wordml/word16du" xmlns:w16sdtdh="http://schemas.microsoft.com/office/word/2020/wordml/sdtdatahash" xmlns:w16se="http://schemas.microsoft.com/office/word/2015/wordml/symex" xmlns:wpg="http://schemas.microsoft.com/office/word/2010/wordprocessingGroup" xmlns:wpi="http://schemas.microsoft.com/office/word/2010/wordprocessingInk" xmlns:wne="http://schemas.microsoft.com/office/word/2006/wordml" xmlns:wps="http://schemas.microsoft.com/office/word/2010/wordprocessingShape" mc:Ignorable="w14 w15 w16se w16cid w16 w16cex w16sdtdh w16du wp14">
+<w:ftr xmlns:wpc="http://schemas.microsoft.com/office/word/2010/wordprocessingCanvas" xmlns:cx="http://schemas.microsoft.com/office/drawing/2014/chartex" xmlns:cx1="http://schemas.microsoft.com/office/drawing/2015/9/8/chartex" xmlns:cx2="http://schemas.microsoft.com/office/drawing/2015/10/21/chartex" xmlns:cx3="http://schemas.microsoft.com/office/drawing/2016/5/9/chartex" xmlns:cx4="http://schemas.microsoft.com/office/drawing/2016/5/10/chartex" xmlns:cx5="http://schemas.microsoft.com/office/drawing/2016/5/11/chartex" xmlns:cx6="http://schemas.microsoft.com/office/drawing/2016/5/12/chartex" xmlns:cx7="http://schemas.microsoft.com/office/drawing/2016/5/13/chartex" xmlns:cx8="http://schemas.microsoft.com/office/drawing/2016/5/14/chartex" xmlns:mc="http://schemas.openxmlformats.org/markup-compatibility/2006" xmlns:aink="http://schemas.microsoft.com/office/drawing/2016/ink" xmlns:am3d="http://schemas.microsoft.com/office/drawing/2017/model3d" xmlns:o="urn:schemas-microsoft-com:office:office" xmlns:oel="http://schemas.microsoft.com/office/2019/extlst" xmlns:r="http://schemas.openxmlformats.org/officeDocument/2006/relationships" xmlns:m="http://schemas.openxmlformats.org/officeDocument/2006/math" xmlns:v="urn:schemas-microsoft-com:vml" xmlns:wp14="http://schemas.microsoft.com/office/word/2010/wordprocessingDrawing" xmlns:wp="http://schemas.openxmlformats.org/drawingml/2006/wordprocessingDrawing" xmlns:w10="urn:schemas-microsoft-com:office:word" xmlns:w="http://schemas.openxmlformats.org/wordprocessingml/2006/main" xmlns:w14="http://schemas.microsoft.com/office/word/2010/wordml" xmlns:w15="http://schemas.microsoft.com/office/word/2012/wordml" xmlns:w16cex="http://schemas.microsoft.com/office/word/2018/wordml/cex" xmlns:w16cid="http://schemas.microsoft.com/office/word/2016/wordml/cid" xmlns:w16="http://schemas.microsoft.com/office/word/2018/wordml" xmlns:w16du="http://schemas.microsoft.com/office/word/2023/wordml/word16du" xmlns:w16sdtdh="http://schemas.microsoft.com/office/word/2020/wordml/sdtdatahash" xmlns:w16sdtfl="http://schemas.microsoft.com/office/word/2024/wordml/sdtformatlock" xmlns:w16se="http://schemas.microsoft.com/office/word/2015/wordml/symex" xmlns:wpg="http://schemas.microsoft.com/office/word/2010/wordprocessingGroup" xmlns:wpi="http://schemas.microsoft.com/office/word/2010/wordprocessingInk" xmlns:wne="http://schemas.microsoft.com/office/word/2006/wordml" xmlns:wps="http://schemas.microsoft.com/office/word/2010/wordprocessingShape" mc:Ignorable="w14 w15 w16se w16cid w16 w16cex w16sdtdh w16sdtfl w16du wp14">
   <w:sdt>
     <w:sdtPr>
       <w:rPr>
@@ -23758,7 +23817,7 @@
 </file>
 
 <file path=word/footer2.xml><?xml version="1.0" encoding="utf-8"?>
-<w:ftr xmlns:wpc="http://schemas.microsoft.com/office/word/2010/wordprocessingCanvas" xmlns:cx="http://schemas.microsoft.com/office/drawing/2014/chartex" xmlns:cx1="http://schemas.microsoft.com/office/drawing/2015/9/8/chartex" xmlns:cx2="http://schemas.microsoft.com/office/drawing/2015/10/21/chartex" xmlns:cx3="http://schemas.microsoft.com/office/drawing/2016/5/9/chartex" xmlns:cx4="http://schemas.microsoft.com/office/drawing/2016/5/10/chartex" xmlns:cx5="http://schemas.microsoft.com/office/drawing/2016/5/11/chartex" xmlns:cx6="http://schemas.microsoft.com/office/drawing/2016/5/12/chartex" xmlns:cx7="http://schemas.microsoft.com/office/drawing/2016/5/13/chartex" xmlns:cx8="http://schemas.microsoft.com/office/drawing/2016/5/14/chartex" xmlns:mc="http://schemas.openxmlformats.org/markup-compatibility/2006" xmlns:aink="http://schemas.microsoft.com/office/drawing/2016/ink" xmlns:am3d="http://schemas.microsoft.com/office/drawing/2017/model3d" xmlns:o="urn:schemas-microsoft-com:office:office" xmlns:oel="http://schemas.microsoft.com/office/2019/extlst" xmlns:r="http://schemas.openxmlformats.org/officeDocument/2006/relationships" xmlns:m="http://schemas.openxmlformats.org/officeDocument/2006/math" xmlns:v="urn:schemas-microsoft-com:vml" xmlns:wp14="http://schemas.microsoft.com/office/word/2010/wordprocessingDrawing" xmlns:wp="http://schemas.openxmlformats.org/drawingml/2006/wordprocessingDrawing" xmlns:w10="urn:schemas-microsoft-com:office:word" xmlns:w="http://schemas.openxmlformats.org/wordprocessingml/2006/main" xmlns:w14="http://schemas.microsoft.com/office/word/2010/wordml" xmlns:w15="http://schemas.microsoft.com/office/word/2012/wordml" xmlns:w16cex="http://schemas.microsoft.com/office/word/2018/wordml/cex" xmlns:w16cid="http://schemas.microsoft.com/office/word/2016/wordml/cid" xmlns:w16="http://schemas.microsoft.com/office/word/2018/wordml" xmlns:w16du="http://schemas.microsoft.com/office/word/2023/wordml/word16du" xmlns:w16sdtdh="http://schemas.microsoft.com/office/word/2020/wordml/sdtdatahash" xmlns:w16se="http://schemas.microsoft.com/office/word/2015/wordml/symex" xmlns:wpg="http://schemas.microsoft.com/office/word/2010/wordprocessingGroup" xmlns:wpi="http://schemas.microsoft.com/office/word/2010/wordprocessingInk" xmlns:wne="http://schemas.microsoft.com/office/word/2006/wordml" xmlns:wps="http://schemas.microsoft.com/office/word/2010/wordprocessingShape" mc:Ignorable="w14 w15 w16se w16cid w16 w16cex w16sdtdh w16du wp14">
+<w:ftr xmlns:wpc="http://schemas.microsoft.com/office/word/2010/wordprocessingCanvas" xmlns:cx="http://schemas.microsoft.com/office/drawing/2014/chartex" xmlns:cx1="http://schemas.microsoft.com/office/drawing/2015/9/8/chartex" xmlns:cx2="http://schemas.microsoft.com/office/drawing/2015/10/21/chartex" xmlns:cx3="http://schemas.microsoft.com/office/drawing/2016/5/9/chartex" xmlns:cx4="http://schemas.microsoft.com/office/drawing/2016/5/10/chartex" xmlns:cx5="http://schemas.microsoft.com/office/drawing/2016/5/11/chartex" xmlns:cx6="http://schemas.microsoft.com/office/drawing/2016/5/12/chartex" xmlns:cx7="http://schemas.microsoft.com/office/drawing/2016/5/13/chartex" xmlns:cx8="http://schemas.microsoft.com/office/drawing/2016/5/14/chartex" xmlns:mc="http://schemas.openxmlformats.org/markup-compatibility/2006" xmlns:aink="http://schemas.microsoft.com/office/drawing/2016/ink" xmlns:am3d="http://schemas.microsoft.com/office/drawing/2017/model3d" xmlns:o="urn:schemas-microsoft-com:office:office" xmlns:oel="http://schemas.microsoft.com/office/2019/extlst" xmlns:r="http://schemas.openxmlformats.org/officeDocument/2006/relationships" xmlns:m="http://schemas.openxmlformats.org/officeDocument/2006/math" xmlns:v="urn:schemas-microsoft-com:vml" xmlns:wp14="http://schemas.microsoft.com/office/word/2010/wordprocessingDrawing" xmlns:wp="http://schemas.openxmlformats.org/drawingml/2006/wordprocessingDrawing" xmlns:w10="urn:schemas-microsoft-com:office:word" xmlns:w="http://schemas.openxmlformats.org/wordprocessingml/2006/main" xmlns:w14="http://schemas.microsoft.com/office/word/2010/wordml" xmlns:w15="http://schemas.microsoft.com/office/word/2012/wordml" xmlns:w16cex="http://schemas.microsoft.com/office/word/2018/wordml/cex" xmlns:w16cid="http://schemas.microsoft.com/office/word/2016/wordml/cid" xmlns:w16="http://schemas.microsoft.com/office/word/2018/wordml" xmlns:w16du="http://schemas.microsoft.com/office/word/2023/wordml/word16du" xmlns:w16sdtdh="http://schemas.microsoft.com/office/word/2020/wordml/sdtdatahash" xmlns:w16sdtfl="http://schemas.microsoft.com/office/word/2024/wordml/sdtformatlock" xmlns:w16se="http://schemas.microsoft.com/office/word/2015/wordml/symex" xmlns:wpg="http://schemas.microsoft.com/office/word/2010/wordprocessingGroup" xmlns:wpi="http://schemas.microsoft.com/office/word/2010/wordprocessingInk" xmlns:wne="http://schemas.microsoft.com/office/word/2006/wordml" xmlns:wps="http://schemas.microsoft.com/office/word/2010/wordprocessingShape" mc:Ignorable="w14 w15 w16se w16cid w16 w16cex w16sdtdh w16sdtfl w16du wp14">
   <w:p>
     <w:pPr>
       <w:pStyle w:val="Pieddepage"/>
@@ -23805,7 +23864,7 @@
 </file>
 
 <file path=word/footnotes.xml><?xml version="1.0" encoding="utf-8"?>
-<w:footnotes xmlns:wpc="http://schemas.microsoft.com/office/word/2010/wordprocessingCanvas" xmlns:cx="http://schemas.microsoft.com/office/drawing/2014/chartex" xmlns:cx1="http://schemas.microsoft.com/office/drawing/2015/9/8/chartex" xmlns:cx2="http://schemas.microsoft.com/office/drawing/2015/10/21/chartex" xmlns:cx3="http://schemas.microsoft.com/office/drawing/2016/5/9/chartex" xmlns:cx4="http://schemas.microsoft.com/office/drawing/2016/5/10/chartex" xmlns:cx5="http://schemas.microsoft.com/office/drawing/2016/5/11/chartex" xmlns:cx6="http://schemas.microsoft.com/office/drawing/2016/5/12/chartex" xmlns:cx7="http://schemas.microsoft.com/office/drawing/2016/5/13/chartex" xmlns:cx8="http://schemas.microsoft.com/office/drawing/2016/5/14/chartex" xmlns:mc="http://schemas.openxmlformats.org/markup-compatibility/2006" xmlns:aink="http://schemas.microsoft.com/office/drawing/2016/ink" xmlns:am3d="http://schemas.microsoft.com/office/drawing/2017/model3d" xmlns:o="urn:schemas-microsoft-com:office:office" xmlns:oel="http://schemas.microsoft.com/office/2019/extlst" xmlns:r="http://schemas.openxmlformats.org/officeDocument/2006/relationships" xmlns:m="http://schemas.openxmlformats.org/officeDocument/2006/math" xmlns:v="urn:schemas-microsoft-com:vml" xmlns:wp14="http://schemas.microsoft.com/office/word/2010/wordprocessingDrawing" xmlns:wp="http://schemas.openxmlformats.org/drawingml/2006/wordprocessingDrawing" xmlns:w10="urn:schemas-microsoft-com:office:word" xmlns:w="http://schemas.openxmlformats.org/wordprocessingml/2006/main" xmlns:w14="http://schemas.microsoft.com/office/word/2010/wordml" xmlns:w15="http://schemas.microsoft.com/office/word/2012/wordml" xmlns:w16cex="http://schemas.microsoft.com/office/word/2018/wordml/cex" xmlns:w16cid="http://schemas.microsoft.com/office/word/2016/wordml/cid" xmlns:w16="http://schemas.microsoft.com/office/word/2018/wordml" xmlns:w16du="http://schemas.microsoft.com/office/word/2023/wordml/word16du" xmlns:w16sdtdh="http://schemas.microsoft.com/office/word/2020/wordml/sdtdatahash" xmlns:w16se="http://schemas.microsoft.com/office/word/2015/wordml/symex" xmlns:wpg="http://schemas.microsoft.com/office/word/2010/wordprocessingGroup" xmlns:wpi="http://schemas.microsoft.com/office/word/2010/wordprocessingInk" xmlns:wne="http://schemas.microsoft.com/office/word/2006/wordml" xmlns:wps="http://schemas.microsoft.com/office/word/2010/wordprocessingShape" mc:Ignorable="w14 w15 w16se w16cid w16 w16cex w16sdtdh w16du wp14">
+<w:footnotes xmlns:wpc="http://schemas.microsoft.com/office/word/2010/wordprocessingCanvas" xmlns:cx="http://schemas.microsoft.com/office/drawing/2014/chartex" xmlns:cx1="http://schemas.microsoft.com/office/drawing/2015/9/8/chartex" xmlns:cx2="http://schemas.microsoft.com/office/drawing/2015/10/21/chartex" xmlns:cx3="http://schemas.microsoft.com/office/drawing/2016/5/9/chartex" xmlns:cx4="http://schemas.microsoft.com/office/drawing/2016/5/10/chartex" xmlns:cx5="http://schemas.microsoft.com/office/drawing/2016/5/11/chartex" xmlns:cx6="http://schemas.microsoft.com/office/drawing/2016/5/12/chartex" xmlns:cx7="http://schemas.microsoft.com/office/drawing/2016/5/13/chartex" xmlns:cx8="http://schemas.microsoft.com/office/drawing/2016/5/14/chartex" xmlns:mc="http://schemas.openxmlformats.org/markup-compatibility/2006" xmlns:aink="http://schemas.microsoft.com/office/drawing/2016/ink" xmlns:am3d="http://schemas.microsoft.com/office/drawing/2017/model3d" xmlns:o="urn:schemas-microsoft-com:office:office" xmlns:oel="http://schemas.microsoft.com/office/2019/extlst" xmlns:r="http://schemas.openxmlformats.org/officeDocument/2006/relationships" xmlns:m="http://schemas.openxmlformats.org/officeDocument/2006/math" xmlns:v="urn:schemas-microsoft-com:vml" xmlns:wp14="http://schemas.microsoft.com/office/word/2010/wordprocessingDrawing" xmlns:wp="http://schemas.openxmlformats.org/drawingml/2006/wordprocessingDrawing" xmlns:w10="urn:schemas-microsoft-com:office:word" xmlns:w="http://schemas.openxmlformats.org/wordprocessingml/2006/main" xmlns:w14="http://schemas.microsoft.com/office/word/2010/wordml" xmlns:w15="http://schemas.microsoft.com/office/word/2012/wordml" xmlns:w16cex="http://schemas.microsoft.com/office/word/2018/wordml/cex" xmlns:w16cid="http://schemas.microsoft.com/office/word/2016/wordml/cid" xmlns:w16="http://schemas.microsoft.com/office/word/2018/wordml" xmlns:w16du="http://schemas.microsoft.com/office/word/2023/wordml/word16du" xmlns:w16sdtdh="http://schemas.microsoft.com/office/word/2020/wordml/sdtdatahash" xmlns:w16sdtfl="http://schemas.microsoft.com/office/word/2024/wordml/sdtformatlock" xmlns:w16se="http://schemas.microsoft.com/office/word/2015/wordml/symex" xmlns:wpg="http://schemas.microsoft.com/office/word/2010/wordprocessingGroup" xmlns:wpi="http://schemas.microsoft.com/office/word/2010/wordprocessingInk" xmlns:wne="http://schemas.microsoft.com/office/word/2006/wordml" xmlns:wps="http://schemas.microsoft.com/office/word/2010/wordprocessingShape" mc:Ignorable="w14 w15 w16se w16cid w16 w16cex w16sdtdh w16sdtfl w16du wp14">
   <w:footnote w:type="separator" w:id="-1">
     <w:p>
       <w:r>
@@ -23824,7 +23883,7 @@
 </file>
 
 <file path=word/header1.xml><?xml version="1.0" encoding="utf-8"?>
-<w:hdr xmlns:wpc="http://schemas.microsoft.com/office/word/2010/wordprocessingCanvas" xmlns:cx="http://schemas.microsoft.com/office/drawing/2014/chartex" xmlns:cx1="http://schemas.microsoft.com/office/drawing/2015/9/8/chartex" xmlns:cx2="http://schemas.microsoft.com/office/drawing/2015/10/21/chartex" xmlns:cx3="http://schemas.microsoft.com/office/drawing/2016/5/9/chartex" xmlns:cx4="http://schemas.microsoft.com/office/drawing/2016/5/10/chartex" xmlns:cx5="http://schemas.microsoft.com/office/drawing/2016/5/11/chartex" xmlns:cx6="http://schemas.microsoft.com/office/drawing/2016/5/12/chartex" xmlns:cx7="http://schemas.microsoft.com/office/drawing/2016/5/13/chartex" xmlns:cx8="http://schemas.microsoft.com/office/drawing/2016/5/14/chartex" xmlns:mc="http://schemas.openxmlformats.org/markup-compatibility/2006" xmlns:aink="http://schemas.microsoft.com/office/drawing/2016/ink" xmlns:am3d="http://schemas.microsoft.com/office/drawing/2017/model3d" xmlns:o="urn:schemas-microsoft-com:office:office" xmlns:oel="http://schemas.microsoft.com/office/2019/extlst" xmlns:r="http://schemas.openxmlformats.org/officeDocument/2006/relationships" xmlns:m="http://schemas.openxmlformats.org/officeDocument/2006/math" xmlns:v="urn:schemas-microsoft-com:vml" xmlns:wp14="http://schemas.microsoft.com/office/word/2010/wordprocessingDrawing" xmlns:wp="http://schemas.openxmlformats.org/drawingml/2006/wordprocessingDrawing" xmlns:w10="urn:schemas-microsoft-com:office:word" xmlns:w="http://schemas.openxmlformats.org/wordprocessingml/2006/main" xmlns:w14="http://schemas.microsoft.com/office/word/2010/wordml" xmlns:w15="http://schemas.microsoft.com/office/word/2012/wordml" xmlns:w16cex="http://schemas.microsoft.com/office/word/2018/wordml/cex" xmlns:w16cid="http://schemas.microsoft.com/office/word/2016/wordml/cid" xmlns:w16="http://schemas.microsoft.com/office/word/2018/wordml" xmlns:w16du="http://schemas.microsoft.com/office/word/2023/wordml/word16du" xmlns:w16sdtdh="http://schemas.microsoft.com/office/word/2020/wordml/sdtdatahash" xmlns:w16se="http://schemas.microsoft.com/office/word/2015/wordml/symex" xmlns:wpg="http://schemas.microsoft.com/office/word/2010/wordprocessingGroup" xmlns:wpi="http://schemas.microsoft.com/office/word/2010/wordprocessingInk" xmlns:wne="http://schemas.microsoft.com/office/word/2006/wordml" xmlns:wps="http://schemas.microsoft.com/office/word/2010/wordprocessingShape" mc:Ignorable="w14 w15 w16se w16cid w16 w16cex w16sdtdh w16du wp14">
+<w:hdr xmlns:wpc="http://schemas.microsoft.com/office/word/2010/wordprocessingCanvas" xmlns:cx="http://schemas.microsoft.com/office/drawing/2014/chartex" xmlns:cx1="http://schemas.microsoft.com/office/drawing/2015/9/8/chartex" xmlns:cx2="http://schemas.microsoft.com/office/drawing/2015/10/21/chartex" xmlns:cx3="http://schemas.microsoft.com/office/drawing/2016/5/9/chartex" xmlns:cx4="http://schemas.microsoft.com/office/drawing/2016/5/10/chartex" xmlns:cx5="http://schemas.microsoft.com/office/drawing/2016/5/11/chartex" xmlns:cx6="http://schemas.microsoft.com/office/drawing/2016/5/12/chartex" xmlns:cx7="http://schemas.microsoft.com/office/drawing/2016/5/13/chartex" xmlns:cx8="http://schemas.microsoft.com/office/drawing/2016/5/14/chartex" xmlns:mc="http://schemas.openxmlformats.org/markup-compatibility/2006" xmlns:aink="http://schemas.microsoft.com/office/drawing/2016/ink" xmlns:am3d="http://schemas.microsoft.com/office/drawing/2017/model3d" xmlns:o="urn:schemas-microsoft-com:office:office" xmlns:oel="http://schemas.microsoft.com/office/2019/extlst" xmlns:r="http://schemas.openxmlformats.org/officeDocument/2006/relationships" xmlns:m="http://schemas.openxmlformats.org/officeDocument/2006/math" xmlns:v="urn:schemas-microsoft-com:vml" xmlns:wp14="http://schemas.microsoft.com/office/word/2010/wordprocessingDrawing" xmlns:wp="http://schemas.openxmlformats.org/drawingml/2006/wordprocessingDrawing" xmlns:w10="urn:schemas-microsoft-com:office:word" xmlns:w="http://schemas.openxmlformats.org/wordprocessingml/2006/main" xmlns:w14="http://schemas.microsoft.com/office/word/2010/wordml" xmlns:w15="http://schemas.microsoft.com/office/word/2012/wordml" xmlns:w16cex="http://schemas.microsoft.com/office/word/2018/wordml/cex" xmlns:w16cid="http://schemas.microsoft.com/office/word/2016/wordml/cid" xmlns:w16="http://schemas.microsoft.com/office/word/2018/wordml" xmlns:w16du="http://schemas.microsoft.com/office/word/2023/wordml/word16du" xmlns:w16sdtdh="http://schemas.microsoft.com/office/word/2020/wordml/sdtdatahash" xmlns:w16sdtfl="http://schemas.microsoft.com/office/word/2024/wordml/sdtformatlock" xmlns:w16se="http://schemas.microsoft.com/office/word/2015/wordml/symex" xmlns:wpg="http://schemas.microsoft.com/office/word/2010/wordprocessingGroup" xmlns:wpi="http://schemas.microsoft.com/office/word/2010/wordprocessingInk" xmlns:wne="http://schemas.microsoft.com/office/word/2006/wordml" xmlns:wps="http://schemas.microsoft.com/office/word/2010/wordprocessingShape" mc:Ignorable="w14 w15 w16se w16cid w16 w16cex w16sdtdh w16sdtfl w16du wp14">
   <w:p>
     <w:pPr>
       <w:pStyle w:val="En-tte"/>
@@ -23901,7 +23960,7 @@
 </file>
 
 <file path=word/header2.xml><?xml version="1.0" encoding="utf-8"?>
-<w:hdr xmlns:wpc="http://schemas.microsoft.com/office/word/2010/wordprocessingCanvas" xmlns:cx="http://schemas.microsoft.com/office/drawing/2014/chartex" xmlns:cx1="http://schemas.microsoft.com/office/drawing/2015/9/8/chartex" xmlns:cx2="http://schemas.microsoft.com/office/drawing/2015/10/21/chartex" xmlns:cx3="http://schemas.microsoft.com/office/drawing/2016/5/9/chartex" xmlns:cx4="http://schemas.microsoft.com/office/drawing/2016/5/10/chartex" xmlns:cx5="http://schemas.microsoft.com/office/drawing/2016/5/11/chartex" xmlns:cx6="http://schemas.microsoft.com/office/drawing/2016/5/12/chartex" xmlns:cx7="http://schemas.microsoft.com/office/drawing/2016/5/13/chartex" xmlns:cx8="http://schemas.microsoft.com/office/drawing/2016/5/14/chartex" xmlns:mc="http://schemas.openxmlformats.org/markup-compatibility/2006" xmlns:aink="http://schemas.microsoft.com/office/drawing/2016/ink" xmlns:am3d="http://schemas.microsoft.com/office/drawing/2017/model3d" xmlns:o="urn:schemas-microsoft-com:office:office" xmlns:oel="http://schemas.microsoft.com/office/2019/extlst" xmlns:r="http://schemas.openxmlformats.org/officeDocument/2006/relationships" xmlns:m="http://schemas.openxmlformats.org/officeDocument/2006/math" xmlns:v="urn:schemas-microsoft-com:vml" xmlns:wp14="http://schemas.microsoft.com/office/word/2010/wordprocessingDrawing" xmlns:wp="http://schemas.openxmlformats.org/drawingml/2006/wordprocessingDrawing" xmlns:w10="urn:schemas-microsoft-com:office:word" xmlns:w="http://schemas.openxmlformats.org/wordprocessingml/2006/main" xmlns:w14="http://schemas.microsoft.com/office/word/2010/wordml" xmlns:w15="http://schemas.microsoft.com/office/word/2012/wordml" xmlns:w16cex="http://schemas.microsoft.com/office/word/2018/wordml/cex" xmlns:w16cid="http://schemas.microsoft.com/office/word/2016/wordml/cid" xmlns:w16="http://schemas.microsoft.com/office/word/2018/wordml" xmlns:w16du="http://schemas.microsoft.com/office/word/2023/wordml/word16du" xmlns:w16sdtdh="http://schemas.microsoft.com/office/word/2020/wordml/sdtdatahash" xmlns:w16se="http://schemas.microsoft.com/office/word/2015/wordml/symex" xmlns:wpg="http://schemas.microsoft.com/office/word/2010/wordprocessingGroup" xmlns:wpi="http://schemas.microsoft.com/office/word/2010/wordprocessingInk" xmlns:wne="http://schemas.microsoft.com/office/word/2006/wordml" xmlns:wps="http://schemas.microsoft.com/office/word/2010/wordprocessingShape" mc:Ignorable="w14 w15 w16se w16cid w16 w16cex w16sdtdh w16du wp14">
+<w:hdr xmlns:wpc="http://schemas.microsoft.com/office/word/2010/wordprocessingCanvas" xmlns:cx="http://schemas.microsoft.com/office/drawing/2014/chartex" xmlns:cx1="http://schemas.microsoft.com/office/drawing/2015/9/8/chartex" xmlns:cx2="http://schemas.microsoft.com/office/drawing/2015/10/21/chartex" xmlns:cx3="http://schemas.microsoft.com/office/drawing/2016/5/9/chartex" xmlns:cx4="http://schemas.microsoft.com/office/drawing/2016/5/10/chartex" xmlns:cx5="http://schemas.microsoft.com/office/drawing/2016/5/11/chartex" xmlns:cx6="http://schemas.microsoft.com/office/drawing/2016/5/12/chartex" xmlns:cx7="http://schemas.microsoft.com/office/drawing/2016/5/13/chartex" xmlns:cx8="http://schemas.microsoft.com/office/drawing/2016/5/14/chartex" xmlns:mc="http://schemas.openxmlformats.org/markup-compatibility/2006" xmlns:aink="http://schemas.microsoft.com/office/drawing/2016/ink" xmlns:am3d="http://schemas.microsoft.com/office/drawing/2017/model3d" xmlns:o="urn:schemas-microsoft-com:office:office" xmlns:oel="http://schemas.microsoft.com/office/2019/extlst" xmlns:r="http://schemas.openxmlformats.org/officeDocument/2006/relationships" xmlns:m="http://schemas.openxmlformats.org/officeDocument/2006/math" xmlns:v="urn:schemas-microsoft-com:vml" xmlns:wp14="http://schemas.microsoft.com/office/word/2010/wordprocessingDrawing" xmlns:wp="http://schemas.openxmlformats.org/drawingml/2006/wordprocessingDrawing" xmlns:w10="urn:schemas-microsoft-com:office:word" xmlns:w="http://schemas.openxmlformats.org/wordprocessingml/2006/main" xmlns:w14="http://schemas.microsoft.com/office/word/2010/wordml" xmlns:w15="http://schemas.microsoft.com/office/word/2012/wordml" xmlns:w16cex="http://schemas.microsoft.com/office/word/2018/wordml/cex" xmlns:w16cid="http://schemas.microsoft.com/office/word/2016/wordml/cid" xmlns:w16="http://schemas.microsoft.com/office/word/2018/wordml" xmlns:w16du="http://schemas.microsoft.com/office/word/2023/wordml/word16du" xmlns:w16sdtdh="http://schemas.microsoft.com/office/word/2020/wordml/sdtdatahash" xmlns:w16sdtfl="http://schemas.microsoft.com/office/word/2024/wordml/sdtformatlock" xmlns:w16se="http://schemas.microsoft.com/office/word/2015/wordml/symex" xmlns:wpg="http://schemas.microsoft.com/office/word/2010/wordprocessingGroup" xmlns:wpi="http://schemas.microsoft.com/office/word/2010/wordprocessingInk" xmlns:wne="http://schemas.microsoft.com/office/word/2006/wordml" xmlns:wps="http://schemas.microsoft.com/office/word/2010/wordprocessingShape" mc:Ignorable="w14 w15 w16se w16cid w16 w16cex w16sdtdh w16sdtfl w16du wp14">
   <w:p>
     <w:pPr>
       <w:pStyle w:val="En-tte"/>
@@ -23978,7 +24037,7 @@
 </file>
 
 <file path=word/numbering.xml><?xml version="1.0" encoding="utf-8"?>
-<w:numbering xmlns:wpc="http://schemas.microsoft.com/office/word/2010/wordprocessingCanvas" xmlns:cx="http://schemas.microsoft.com/office/drawing/2014/chartex" xmlns:cx1="http://schemas.microsoft.com/office/drawing/2015/9/8/chartex" xmlns:cx2="http://schemas.microsoft.com/office/drawing/2015/10/21/chartex" xmlns:cx3="http://schemas.microsoft.com/office/drawing/2016/5/9/chartex" xmlns:cx4="http://schemas.microsoft.com/office/drawing/2016/5/10/chartex" xmlns:cx5="http://schemas.microsoft.com/office/drawing/2016/5/11/chartex" xmlns:cx6="http://schemas.microsoft.com/office/drawing/2016/5/12/chartex" xmlns:cx7="http://schemas.microsoft.com/office/drawing/2016/5/13/chartex" xmlns:cx8="http://schemas.microsoft.com/office/drawing/2016/5/14/chartex" xmlns:mc="http://schemas.openxmlformats.org/markup-compatibility/2006" xmlns:aink="http://schemas.microsoft.com/office/drawing/2016/ink" xmlns:am3d="http://schemas.microsoft.com/office/drawing/2017/model3d" xmlns:o="urn:schemas-microsoft-com:office:office" xmlns:oel="http://schemas.microsoft.com/office/2019/extlst" xmlns:r="http://schemas.openxmlformats.org/officeDocument/2006/relationships" xmlns:m="http://schemas.openxmlformats.org/officeDocument/2006/math" xmlns:v="urn:schemas-microsoft-com:vml" xmlns:wp14="http://schemas.microsoft.com/office/word/2010/wordprocessingDrawing" xmlns:wp="http://schemas.openxmlformats.org/drawingml/2006/wordprocessingDrawing" xmlns:w10="urn:schemas-microsoft-com:office:word" xmlns:w="http://schemas.openxmlformats.org/wordprocessingml/2006/main" xmlns:w14="http://schemas.microsoft.com/office/word/2010/wordml" xmlns:w15="http://schemas.microsoft.com/office/word/2012/wordml" xmlns:w16cex="http://schemas.microsoft.com/office/word/2018/wordml/cex" xmlns:w16cid="http://schemas.microsoft.com/office/word/2016/wordml/cid" xmlns:w16="http://schemas.microsoft.com/office/word/2018/wordml" xmlns:w16du="http://schemas.microsoft.com/office/word/2023/wordml/word16du" xmlns:w16sdtdh="http://schemas.microsoft.com/office/word/2020/wordml/sdtdatahash" xmlns:w16se="http://schemas.microsoft.com/office/word/2015/wordml/symex" xmlns:wpg="http://schemas.microsoft.com/office/word/2010/wordprocessingGroup" xmlns:wpi="http://schemas.microsoft.com/office/word/2010/wordprocessingInk" xmlns:wne="http://schemas.microsoft.com/office/word/2006/wordml" xmlns:wps="http://schemas.microsoft.com/office/word/2010/wordprocessingShape" mc:Ignorable="w14 w15 w16se w16cid w16 w16cex w16sdtdh w16du wp14">
+<w:numbering xmlns:wpc="http://schemas.microsoft.com/office/word/2010/wordprocessingCanvas" xmlns:cx="http://schemas.microsoft.com/office/drawing/2014/chartex" xmlns:cx1="http://schemas.microsoft.com/office/drawing/2015/9/8/chartex" xmlns:cx2="http://schemas.microsoft.com/office/drawing/2015/10/21/chartex" xmlns:cx3="http://schemas.microsoft.com/office/drawing/2016/5/9/chartex" xmlns:cx4="http://schemas.microsoft.com/office/drawing/2016/5/10/chartex" xmlns:cx5="http://schemas.microsoft.com/office/drawing/2016/5/11/chartex" xmlns:cx6="http://schemas.microsoft.com/office/drawing/2016/5/12/chartex" xmlns:cx7="http://schemas.microsoft.com/office/drawing/2016/5/13/chartex" xmlns:cx8="http://schemas.microsoft.com/office/drawing/2016/5/14/chartex" xmlns:mc="http://schemas.openxmlformats.org/markup-compatibility/2006" xmlns:aink="http://schemas.microsoft.com/office/drawing/2016/ink" xmlns:am3d="http://schemas.microsoft.com/office/drawing/2017/model3d" xmlns:o="urn:schemas-microsoft-com:office:office" xmlns:oel="http://schemas.microsoft.com/office/2019/extlst" xmlns:r="http://schemas.openxmlformats.org/officeDocument/2006/relationships" xmlns:m="http://schemas.openxmlformats.org/officeDocument/2006/math" xmlns:v="urn:schemas-microsoft-com:vml" xmlns:wp14="http://schemas.microsoft.com/office/word/2010/wordprocessingDrawing" xmlns:wp="http://schemas.openxmlformats.org/drawingml/2006/wordprocessingDrawing" xmlns:w10="urn:schemas-microsoft-com:office:word" xmlns:w="http://schemas.openxmlformats.org/wordprocessingml/2006/main" xmlns:w14="http://schemas.microsoft.com/office/word/2010/wordml" xmlns:w15="http://schemas.microsoft.com/office/word/2012/wordml" xmlns:w16cex="http://schemas.microsoft.com/office/word/2018/wordml/cex" xmlns:w16cid="http://schemas.microsoft.com/office/word/2016/wordml/cid" xmlns:w16="http://schemas.microsoft.com/office/word/2018/wordml" xmlns:w16du="http://schemas.microsoft.com/office/word/2023/wordml/word16du" xmlns:w16sdtdh="http://schemas.microsoft.com/office/word/2020/wordml/sdtdatahash" xmlns:w16sdtfl="http://schemas.microsoft.com/office/word/2024/wordml/sdtformatlock" xmlns:w16se="http://schemas.microsoft.com/office/word/2015/wordml/symex" xmlns:wpg="http://schemas.microsoft.com/office/word/2010/wordprocessingGroup" xmlns:wpi="http://schemas.microsoft.com/office/word/2010/wordprocessingInk" xmlns:wne="http://schemas.microsoft.com/office/word/2006/wordml" xmlns:wps="http://schemas.microsoft.com/office/word/2010/wordprocessingShape" mc:Ignorable="w14 w15 w16se w16cid w16 w16cex w16sdtdh w16sdtfl w16du wp14">
   <w:abstractNum w:abstractNumId="0" w15:restartNumberingAfterBreak="0">
     <w:nsid w:val="FFFFFF7C"/>
     <w:multiLevelType w:val="singleLevel"/>
@@ -24319,6 +24378,92 @@
     </w:lvl>
   </w:abstractNum>
   <w:abstractNum w:abstractNumId="12" w15:restartNumberingAfterBreak="0">
+    <w:nsid w:val="0701694A"/>
+    <w:multiLevelType w:val="hybridMultilevel"/>
+    <w:tmpl w:val="F7FC1F24"/>
+    <w:lvl w:ilvl="0" w:tplc="040C000F">
+      <w:start w:val="1"/>
+      <w:numFmt w:val="decimal"/>
+      <w:lvlText w:val="%1."/>
+      <w:lvlJc w:val="left"/>
+      <w:pPr>
+        <w:ind w:left="720" w:hanging="360"/>
+      </w:pPr>
+    </w:lvl>
+    <w:lvl w:ilvl="1" w:tplc="040C0019" w:tentative="1">
+      <w:start w:val="1"/>
+      <w:numFmt w:val="lowerLetter"/>
+      <w:lvlText w:val="%2."/>
+      <w:lvlJc w:val="left"/>
+      <w:pPr>
+        <w:ind w:left="1440" w:hanging="360"/>
+      </w:pPr>
+    </w:lvl>
+    <w:lvl w:ilvl="2" w:tplc="040C001B" w:tentative="1">
+      <w:start w:val="1"/>
+      <w:numFmt w:val="lowerRoman"/>
+      <w:lvlText w:val="%3."/>
+      <w:lvlJc w:val="right"/>
+      <w:pPr>
+        <w:ind w:left="2160" w:hanging="180"/>
+      </w:pPr>
+    </w:lvl>
+    <w:lvl w:ilvl="3" w:tplc="040C000F" w:tentative="1">
+      <w:start w:val="1"/>
+      <w:numFmt w:val="decimal"/>
+      <w:lvlText w:val="%4."/>
+      <w:lvlJc w:val="left"/>
+      <w:pPr>
+        <w:ind w:left="2880" w:hanging="360"/>
+      </w:pPr>
+    </w:lvl>
+    <w:lvl w:ilvl="4" w:tplc="040C0019" w:tentative="1">
+      <w:start w:val="1"/>
+      <w:numFmt w:val="lowerLetter"/>
+      <w:lvlText w:val="%5."/>
+      <w:lvlJc w:val="left"/>
+      <w:pPr>
+        <w:ind w:left="3600" w:hanging="360"/>
+      </w:pPr>
+    </w:lvl>
+    <w:lvl w:ilvl="5" w:tplc="040C001B" w:tentative="1">
+      <w:start w:val="1"/>
+      <w:numFmt w:val="lowerRoman"/>
+      <w:lvlText w:val="%6."/>
+      <w:lvlJc w:val="right"/>
+      <w:pPr>
+        <w:ind w:left="4320" w:hanging="180"/>
+      </w:pPr>
+    </w:lvl>
+    <w:lvl w:ilvl="6" w:tplc="040C000F" w:tentative="1">
+      <w:start w:val="1"/>
+      <w:numFmt w:val="decimal"/>
+      <w:lvlText w:val="%7."/>
+      <w:lvlJc w:val="left"/>
+      <w:pPr>
+        <w:ind w:left="5040" w:hanging="360"/>
+      </w:pPr>
+    </w:lvl>
+    <w:lvl w:ilvl="7" w:tplc="040C0019" w:tentative="1">
+      <w:start w:val="1"/>
+      <w:numFmt w:val="lowerLetter"/>
+      <w:lvlText w:val="%8."/>
+      <w:lvlJc w:val="left"/>
+      <w:pPr>
+        <w:ind w:left="5760" w:hanging="360"/>
+      </w:pPr>
+    </w:lvl>
+    <w:lvl w:ilvl="8" w:tplc="040C001B" w:tentative="1">
+      <w:start w:val="1"/>
+      <w:numFmt w:val="lowerRoman"/>
+      <w:lvlText w:val="%9."/>
+      <w:lvlJc w:val="right"/>
+      <w:pPr>
+        <w:ind w:left="6480" w:hanging="180"/>
+      </w:pPr>
+    </w:lvl>
+  </w:abstractNum>
+  <w:abstractNum w:abstractNumId="13" w15:restartNumberingAfterBreak="0">
     <w:nsid w:val="0E1F7585"/>
     <w:multiLevelType w:val="multilevel"/>
     <w:tmpl w:val="040C001F"/>
@@ -24404,7 +24549,7 @@
       </w:pPr>
     </w:lvl>
   </w:abstractNum>
-  <w:abstractNum w:abstractNumId="13" w15:restartNumberingAfterBreak="0">
+  <w:abstractNum w:abstractNumId="14" w15:restartNumberingAfterBreak="0">
     <w:nsid w:val="3CC0541E"/>
     <w:multiLevelType w:val="multilevel"/>
     <w:tmpl w:val="040C001F"/>
@@ -24490,7 +24635,7 @@
       </w:pPr>
     </w:lvl>
   </w:abstractNum>
-  <w:abstractNum w:abstractNumId="14" w15:restartNumberingAfterBreak="0">
+  <w:abstractNum w:abstractNumId="15" w15:restartNumberingAfterBreak="0">
     <w:nsid w:val="3F415782"/>
     <w:multiLevelType w:val="multilevel"/>
     <w:tmpl w:val="040C001D"/>
@@ -24576,7 +24721,7 @@
       </w:pPr>
     </w:lvl>
   </w:abstractNum>
-  <w:abstractNum w:abstractNumId="15" w15:restartNumberingAfterBreak="0">
+  <w:abstractNum w:abstractNumId="16" w15:restartNumberingAfterBreak="0">
     <w:nsid w:val="4C9E7CA0"/>
     <w:multiLevelType w:val="multilevel"/>
     <w:tmpl w:val="040C0025"/>
@@ -24671,7 +24816,7 @@
       </w:pPr>
     </w:lvl>
   </w:abstractNum>
-  <w:abstractNum w:abstractNumId="16" w15:restartNumberingAfterBreak="0">
+  <w:abstractNum w:abstractNumId="17" w15:restartNumberingAfterBreak="0">
     <w:nsid w:val="55600147"/>
     <w:multiLevelType w:val="hybridMultilevel"/>
     <w:tmpl w:val="43742E2C"/>
@@ -24757,7 +24902,7 @@
       </w:pPr>
     </w:lvl>
   </w:abstractNum>
-  <w:abstractNum w:abstractNumId="17" w15:restartNumberingAfterBreak="0">
+  <w:abstractNum w:abstractNumId="18" w15:restartNumberingAfterBreak="0">
     <w:nsid w:val="59F97664"/>
     <w:multiLevelType w:val="multilevel"/>
     <w:tmpl w:val="6E0C506C"/>
@@ -24843,7 +24988,93 @@
       </w:pPr>
     </w:lvl>
   </w:abstractNum>
-  <w:abstractNum w:abstractNumId="18" w15:restartNumberingAfterBreak="0">
+  <w:abstractNum w:abstractNumId="19" w15:restartNumberingAfterBreak="0">
+    <w:nsid w:val="698E3C96"/>
+    <w:multiLevelType w:val="hybridMultilevel"/>
+    <w:tmpl w:val="E8940DE6"/>
+    <w:lvl w:ilvl="0" w:tplc="040C000F">
+      <w:start w:val="1"/>
+      <w:numFmt w:val="decimal"/>
+      <w:lvlText w:val="%1."/>
+      <w:lvlJc w:val="left"/>
+      <w:pPr>
+        <w:ind w:left="720" w:hanging="360"/>
+      </w:pPr>
+    </w:lvl>
+    <w:lvl w:ilvl="1" w:tplc="040C0019" w:tentative="1">
+      <w:start w:val="1"/>
+      <w:numFmt w:val="lowerLetter"/>
+      <w:lvlText w:val="%2."/>
+      <w:lvlJc w:val="left"/>
+      <w:pPr>
+        <w:ind w:left="1440" w:hanging="360"/>
+      </w:pPr>
+    </w:lvl>
+    <w:lvl w:ilvl="2" w:tplc="040C001B">
+      <w:start w:val="1"/>
+      <w:numFmt w:val="lowerRoman"/>
+      <w:lvlText w:val="%3."/>
+      <w:lvlJc w:val="right"/>
+      <w:pPr>
+        <w:ind w:left="2160" w:hanging="180"/>
+      </w:pPr>
+    </w:lvl>
+    <w:lvl w:ilvl="3" w:tplc="040C000F" w:tentative="1">
+      <w:start w:val="1"/>
+      <w:numFmt w:val="decimal"/>
+      <w:lvlText w:val="%4."/>
+      <w:lvlJc w:val="left"/>
+      <w:pPr>
+        <w:ind w:left="2880" w:hanging="360"/>
+      </w:pPr>
+    </w:lvl>
+    <w:lvl w:ilvl="4" w:tplc="040C0019" w:tentative="1">
+      <w:start w:val="1"/>
+      <w:numFmt w:val="lowerLetter"/>
+      <w:lvlText w:val="%5."/>
+      <w:lvlJc w:val="left"/>
+      <w:pPr>
+        <w:ind w:left="3600" w:hanging="360"/>
+      </w:pPr>
+    </w:lvl>
+    <w:lvl w:ilvl="5" w:tplc="040C001B" w:tentative="1">
+      <w:start w:val="1"/>
+      <w:numFmt w:val="lowerRoman"/>
+      <w:lvlText w:val="%6."/>
+      <w:lvlJc w:val="right"/>
+      <w:pPr>
+        <w:ind w:left="4320" w:hanging="180"/>
+      </w:pPr>
+    </w:lvl>
+    <w:lvl w:ilvl="6" w:tplc="040C000F" w:tentative="1">
+      <w:start w:val="1"/>
+      <w:numFmt w:val="decimal"/>
+      <w:lvlText w:val="%7."/>
+      <w:lvlJc w:val="left"/>
+      <w:pPr>
+        <w:ind w:left="5040" w:hanging="360"/>
+      </w:pPr>
+    </w:lvl>
+    <w:lvl w:ilvl="7" w:tplc="040C0019" w:tentative="1">
+      <w:start w:val="1"/>
+      <w:numFmt w:val="lowerLetter"/>
+      <w:lvlText w:val="%8."/>
+      <w:lvlJc w:val="left"/>
+      <w:pPr>
+        <w:ind w:left="5760" w:hanging="360"/>
+      </w:pPr>
+    </w:lvl>
+    <w:lvl w:ilvl="8" w:tplc="040C001B" w:tentative="1">
+      <w:start w:val="1"/>
+      <w:numFmt w:val="lowerRoman"/>
+      <w:lvlText w:val="%9."/>
+      <w:lvlJc w:val="right"/>
+      <w:pPr>
+        <w:ind w:left="6480" w:hanging="180"/>
+      </w:pPr>
+    </w:lvl>
+  </w:abstractNum>
+  <w:abstractNum w:abstractNumId="20" w15:restartNumberingAfterBreak="0">
     <w:nsid w:val="6B0A1D33"/>
     <w:multiLevelType w:val="hybridMultilevel"/>
     <w:tmpl w:val="AFA03A5C"/>
@@ -24939,16 +25170,16 @@
     <w:abstractNumId w:val="11"/>
   </w:num>
   <w:num w:numId="4" w16cid:durableId="479270447">
-    <w:abstractNumId w:val="13"/>
+    <w:abstractNumId w:val="14"/>
   </w:num>
   <w:num w:numId="5" w16cid:durableId="1594851319">
-    <w:abstractNumId w:val="16"/>
+    <w:abstractNumId w:val="17"/>
   </w:num>
   <w:num w:numId="6" w16cid:durableId="2001762171">
-    <w:abstractNumId w:val="18"/>
+    <w:abstractNumId w:val="20"/>
   </w:num>
   <w:num w:numId="7" w16cid:durableId="2071338923">
-    <w:abstractNumId w:val="14"/>
+    <w:abstractNumId w:val="15"/>
   </w:num>
   <w:num w:numId="8" w16cid:durableId="123545370">
     <w:abstractNumId w:val="10"/>
@@ -24996,34 +25227,34 @@
     <w:abstractNumId w:val="11"/>
   </w:num>
   <w:num w:numId="23" w16cid:durableId="1508249348">
-    <w:abstractNumId w:val="13"/>
+    <w:abstractNumId w:val="14"/>
     <w:lvlOverride w:ilvl="0">
       <w:startOverride w:val="1"/>
     </w:lvlOverride>
   </w:num>
   <w:num w:numId="24" w16cid:durableId="2036881777">
-    <w:abstractNumId w:val="13"/>
+    <w:abstractNumId w:val="14"/>
     <w:lvlOverride w:ilvl="0">
       <w:startOverride w:val="1"/>
     </w:lvlOverride>
   </w:num>
   <w:num w:numId="25" w16cid:durableId="291444199">
-    <w:abstractNumId w:val="13"/>
+    <w:abstractNumId w:val="14"/>
     <w:lvlOverride w:ilvl="0">
       <w:startOverride w:val="1"/>
     </w:lvlOverride>
   </w:num>
   <w:num w:numId="26" w16cid:durableId="1089733524">
-    <w:abstractNumId w:val="13"/>
+    <w:abstractNumId w:val="14"/>
     <w:lvlOverride w:ilvl="0">
       <w:startOverride w:val="1"/>
     </w:lvlOverride>
   </w:num>
   <w:num w:numId="27" w16cid:durableId="2101565294">
-    <w:abstractNumId w:val="17"/>
+    <w:abstractNumId w:val="18"/>
   </w:num>
   <w:num w:numId="28" w16cid:durableId="1434476032">
-    <w:abstractNumId w:val="13"/>
+    <w:abstractNumId w:val="14"/>
     <w:lvlOverride w:ilvl="0">
       <w:startOverride w:val="1"/>
     </w:lvlOverride>
@@ -25053,7 +25284,7 @@
     </w:lvlOverride>
   </w:num>
   <w:num w:numId="29" w16cid:durableId="789015359">
-    <w:abstractNumId w:val="13"/>
+    <w:abstractNumId w:val="14"/>
     <w:lvlOverride w:ilvl="0">
       <w:startOverride w:val="1"/>
     </w:lvlOverride>
@@ -25083,7 +25314,7 @@
     </w:lvlOverride>
   </w:num>
   <w:num w:numId="30" w16cid:durableId="493955531">
-    <w:abstractNumId w:val="13"/>
+    <w:abstractNumId w:val="14"/>
     <w:lvlOverride w:ilvl="0">
       <w:startOverride w:val="1"/>
     </w:lvlOverride>
@@ -25113,7 +25344,7 @@
     </w:lvlOverride>
   </w:num>
   <w:num w:numId="31" w16cid:durableId="451830222">
-    <w:abstractNumId w:val="13"/>
+    <w:abstractNumId w:val="14"/>
     <w:lvlOverride w:ilvl="0">
       <w:startOverride w:val="1"/>
     </w:lvlOverride>
@@ -25143,10 +25374,10 @@
     </w:lvlOverride>
   </w:num>
   <w:num w:numId="32" w16cid:durableId="1947618515">
-    <w:abstractNumId w:val="12"/>
+    <w:abstractNumId w:val="13"/>
   </w:num>
   <w:num w:numId="33" w16cid:durableId="882256099">
-    <w:abstractNumId w:val="15"/>
+    <w:abstractNumId w:val="16"/>
   </w:num>
   <w:num w:numId="34" w16cid:durableId="277951395">
     <w:abstractNumId w:val="10"/>
@@ -25154,11 +25385,17 @@
   <w:num w:numId="35" w16cid:durableId="338047539">
     <w:abstractNumId w:val="11"/>
   </w:num>
+  <w:num w:numId="36" w16cid:durableId="36708509">
+    <w:abstractNumId w:val="19"/>
+  </w:num>
+  <w:num w:numId="37" w16cid:durableId="92096423">
+    <w:abstractNumId w:val="12"/>
+  </w:num>
 </w:numbering>
 </file>
 
 <file path=word/styles.xml><?xml version="1.0" encoding="utf-8"?>
-<w:styles xmlns:mc="http://schemas.openxmlformats.org/markup-compatibility/2006" xmlns:r="http://schemas.openxmlformats.org/officeDocument/2006/relationships" xmlns:w="http://schemas.openxmlformats.org/wordprocessingml/2006/main" xmlns:w14="http://schemas.microsoft.com/office/word/2010/wordml" xmlns:w15="http://schemas.microsoft.com/office/word/2012/wordml" xmlns:w16cex="http://schemas.microsoft.com/office/word/2018/wordml/cex" xmlns:w16cid="http://schemas.microsoft.com/office/word/2016/wordml/cid" xmlns:w16="http://schemas.microsoft.com/office/word/2018/wordml" xmlns:w16du="http://schemas.microsoft.com/office/word/2023/wordml/word16du" xmlns:w16sdtdh="http://schemas.microsoft.com/office/word/2020/wordml/sdtdatahash" xmlns:w16se="http://schemas.microsoft.com/office/word/2015/wordml/symex" mc:Ignorable="w14 w15 w16se w16cid w16 w16cex w16sdtdh w16du">
+<w:styles xmlns:mc="http://schemas.openxmlformats.org/markup-compatibility/2006" xmlns:r="http://schemas.openxmlformats.org/officeDocument/2006/relationships" xmlns:w="http://schemas.openxmlformats.org/wordprocessingml/2006/main" xmlns:w14="http://schemas.microsoft.com/office/word/2010/wordml" xmlns:w15="http://schemas.microsoft.com/office/word/2012/wordml" xmlns:w16cex="http://schemas.microsoft.com/office/word/2018/wordml/cex" xmlns:w16cid="http://schemas.microsoft.com/office/word/2016/wordml/cid" xmlns:w16="http://schemas.microsoft.com/office/word/2018/wordml" xmlns:w16du="http://schemas.microsoft.com/office/word/2023/wordml/word16du" xmlns:w16sdtdh="http://schemas.microsoft.com/office/word/2020/wordml/sdtdatahash" xmlns:w16sdtfl="http://schemas.microsoft.com/office/word/2024/wordml/sdtformatlock" xmlns:w16se="http://schemas.microsoft.com/office/word/2015/wordml/symex" mc:Ignorable="w14 w15 w16se w16cid w16 w16cex w16sdtdh w16sdtfl w16du">
   <w:docDefaults>
     <w:rPrDefault>
       <w:rPr>

</xml_diff>